<commit_message>
Update README and docs
</commit_message>
<xml_diff>
--- a/docs/architecture.docx
+++ b/docs/architecture.docx
@@ -10,7 +10,7 @@
         <w:t xml:space="preserve">Game Leaderboard — Architecture</w:t>
       </w:r>
     </w:p>
-    <w:bookmarkStart w:id="18" w:name="game-leaderboard-architecture"/>
+    <w:bookmarkStart w:id="19" w:name="game-leaderboard-architecture"/>
     <w:p>
       <w:pPr>
         <w:pStyle w:val="Heading1"/>
@@ -481,13 +481,21 @@
       </w:r>
     </w:p>
     <w:bookmarkEnd w:id="9"/>
-    <w:bookmarkStart w:id="10" w:name="functional-requirements"/>
+    <w:bookmarkStart w:id="10" w:name="example-write-and-read-flow"/>
     <w:p>
       <w:pPr>
         <w:pStyle w:val="Heading2"/>
       </w:pPr>
       <w:r>
-        <w:t xml:space="preserve">Functional Requirements</w:t>
+        <w:t xml:space="preserve">Example: Write and Read Flow</w:t>
+      </w:r>
+    </w:p>
+    <w:p>
+      <w:pPr>
+        <w:pStyle w:val="FirstParagraph"/>
+      </w:pPr>
+      <w:r>
+        <w:t xml:space="preserve">Concretely, submitting and then reading a score walks the diagram like this:</w:t>
       </w:r>
     </w:p>
     <w:p>
@@ -499,7 +507,74 @@
         </w:numPr>
       </w:pPr>
       <w:r>
-        <w:t xml:space="preserve">Users can post score updates for specific games.</w:t>
+        <w:rPr>
+          <w:b/>
+          <w:bCs/>
+        </w:rPr>
+        <w:t xml:space="preserve">Write</w:t>
+      </w:r>
+      <w:r>
+        <w:t xml:space="preserve"> </w:t>
+      </w:r>
+      <w:r>
+        <w:t xml:space="preserve">—</w:t>
+      </w:r>
+      <w:r>
+        <w:t xml:space="preserve"> </w:t>
+      </w:r>
+      <w:r>
+        <w:rPr>
+          <w:rStyle w:val="VerbatimChar"/>
+        </w:rPr>
+        <w:t xml:space="preserve">POST /api/leaderboard {"gameId":1,"playerName":"alice","score":90}</w:t>
+      </w:r>
+      <w:r>
+        <w:t xml:space="preserve"> </w:t>
+      </w:r>
+      <w:r>
+        <w:t xml:space="preserve">lands on the nearest region’s API, which writes it to the single-leader primary store (deduped on</w:t>
+      </w:r>
+      <w:r>
+        <w:t xml:space="preserve"> </w:t>
+      </w:r>
+      <w:r>
+        <w:rPr>
+          <w:rStyle w:val="VerbatimChar"/>
+        </w:rPr>
+        <w:t xml:space="preserve">Idempotency-Key</w:t>
+      </w:r>
+      <w:r>
+        <w:t xml:space="preserve"> </w:t>
+      </w:r>
+      <w:r>
+        <w:t xml:space="preserve">if the client sent one) and returns</w:t>
+      </w:r>
+      <w:r>
+        <w:t xml:space="preserve"> </w:t>
+      </w:r>
+      <w:r>
+        <w:rPr>
+          <w:rStyle w:val="VerbatimChar"/>
+        </w:rPr>
+        <w:t xml:space="preserve">201</w:t>
+      </w:r>
+      <w:r>
+        <w:t xml:space="preserve"> </w:t>
+      </w:r>
+      <w:r>
+        <w:t xml:space="preserve">immediately. The primary store then publishes a</w:t>
+      </w:r>
+      <w:r>
+        <w:t xml:space="preserve"> </w:t>
+      </w:r>
+      <w:r>
+        <w:t xml:space="preserve">“score updated”</w:t>
+      </w:r>
+      <w:r>
+        <w:t xml:space="preserve"> </w:t>
+      </w:r>
+      <w:r>
+        <w:t xml:space="preserve">event to the Kafka topic.</w:t>
       </w:r>
     </w:p>
     <w:p>
@@ -511,22 +586,29 @@
         </w:numPr>
       </w:pPr>
       <w:r>
-        <w:t xml:space="preserve">Query the top 100 for a game via a</w:t>
-      </w:r>
-      <w:r>
-        <w:t xml:space="preserve"> </w:t>
-      </w:r>
-      <w:r>
-        <w:rPr>
-          <w:rStyle w:val="VerbatimChar"/>
-        </w:rPr>
-        <w:t xml:space="preserve">GET</w:t>
-      </w:r>
-      <w:r>
-        <w:t xml:space="preserve"> </w:t>
-      </w:r>
-      <w:r>
-        <w:t xml:space="preserve">request.</w:t>
+        <w:rPr>
+          <w:b/>
+          <w:bCs/>
+        </w:rPr>
+        <w:t xml:space="preserve">Fan-out</w:t>
+      </w:r>
+      <w:r>
+        <w:t xml:space="preserve"> </w:t>
+      </w:r>
+      <w:r>
+        <w:t xml:space="preserve">— every region’s cache consumer picks up that event and updates its local sorted set for</w:t>
+      </w:r>
+      <w:r>
+        <w:t xml:space="preserve"> </w:t>
+      </w:r>
+      <w:r>
+        <w:rPr>
+          <w:rStyle w:val="VerbatimChar"/>
+        </w:rPr>
+        <w:t xml:space="preserve">gameId=1</w:t>
+      </w:r>
+      <w:r>
+        <w:t xml:space="preserve">, asynchronously and independently of the write’s response.</w:t>
       </w:r>
     </w:p>
     <w:p>
@@ -538,6 +620,104 @@
         </w:numPr>
       </w:pPr>
       <w:r>
+        <w:rPr>
+          <w:b/>
+          <w:bCs/>
+        </w:rPr>
+        <w:t xml:space="preserve">Read</w:t>
+      </w:r>
+      <w:r>
+        <w:t xml:space="preserve"> </w:t>
+      </w:r>
+      <w:r>
+        <w:t xml:space="preserve">—</w:t>
+      </w:r>
+      <w:r>
+        <w:t xml:space="preserve"> </w:t>
+      </w:r>
+      <w:r>
+        <w:rPr>
+          <w:rStyle w:val="VerbatimChar"/>
+        </w:rPr>
+        <w:t xml:space="preserve">GET /api/leaderboard/game/1</w:t>
+      </w:r>
+      <w:r>
+        <w:t xml:space="preserve"> </w:t>
+      </w:r>
+      <w:r>
+        <w:t xml:space="preserve">and</w:t>
+      </w:r>
+      <w:r>
+        <w:t xml:space="preserve"> </w:t>
+      </w:r>
+      <w:r>
+        <w:rPr>
+          <w:rStyle w:val="VerbatimChar"/>
+        </w:rPr>
+        <w:t xml:space="preserve">GET /api/leaderboard/{id}/rank</w:t>
+      </w:r>
+      <w:r>
+        <w:t xml:space="preserve">, from any region, are served entirely from that region’s local sorted set — no hop back to the primary store — so they stay fast even under global load. They may briefly lag the write until fan-out completes.</w:t>
+      </w:r>
+    </w:p>
+    <w:bookmarkEnd w:id="10"/>
+    <w:bookmarkStart w:id="11" w:name="functional-requirements"/>
+    <w:p>
+      <w:pPr>
+        <w:pStyle w:val="Heading2"/>
+      </w:pPr>
+      <w:r>
+        <w:t xml:space="preserve">Functional Requirements</w:t>
+      </w:r>
+    </w:p>
+    <w:p>
+      <w:pPr>
+        <w:pStyle w:val="Compact"/>
+        <w:numPr>
+          <w:ilvl w:val="0"/>
+          <w:numId w:val="1002"/>
+        </w:numPr>
+      </w:pPr>
+      <w:r>
+        <w:t xml:space="preserve">Users can post score updates for specific games.</w:t>
+      </w:r>
+    </w:p>
+    <w:p>
+      <w:pPr>
+        <w:pStyle w:val="Compact"/>
+        <w:numPr>
+          <w:ilvl w:val="0"/>
+          <w:numId w:val="1002"/>
+        </w:numPr>
+      </w:pPr>
+      <w:r>
+        <w:t xml:space="preserve">Query the top 100 for a game via a</w:t>
+      </w:r>
+      <w:r>
+        <w:t xml:space="preserve"> </w:t>
+      </w:r>
+      <w:r>
+        <w:rPr>
+          <w:rStyle w:val="VerbatimChar"/>
+        </w:rPr>
+        <w:t xml:space="preserve">GET</w:t>
+      </w:r>
+      <w:r>
+        <w:t xml:space="preserve"> </w:t>
+      </w:r>
+      <w:r>
+        <w:t xml:space="preserve">request.</w:t>
+      </w:r>
+    </w:p>
+    <w:p>
+      <w:pPr>
+        <w:pStyle w:val="Compact"/>
+        <w:numPr>
+          <w:ilvl w:val="0"/>
+          <w:numId w:val="1002"/>
+        </w:numPr>
+      </w:pPr>
+      <w:r>
         <w:t xml:space="preserve">Query a specific</w:t>
       </w:r>
       <w:r>
@@ -568,8 +748,8 @@
         <w:t xml:space="preserve">— returns both the user’s raw score and their rank relative to other players.</w:t>
       </w:r>
     </w:p>
-    <w:bookmarkEnd w:id="10"/>
-    <w:bookmarkStart w:id="11" w:name="X3894af4dc6d5c6017231d3693afda589907704f"/>
+    <w:bookmarkEnd w:id="11"/>
+    <w:bookmarkStart w:id="12" w:name="X3894af4dc6d5c6017231d3693afda589907704f"/>
     <w:p>
       <w:pPr>
         <w:pStyle w:val="Heading2"/>
@@ -707,23 +887,29 @@
               <w:pStyle w:val="Compact"/>
             </w:pPr>
             <w:r>
-              <w:t xml:space="preserve">Each write carries an idempotency key (e.g. </w:t>
+              <w:t xml:space="preserve">Each write can carry an</w:t>
+            </w:r>
+            <w:r>
+              <w:t xml:space="preserve"> </w:t>
             </w:r>
             <w:r>
               <w:rPr>
                 <w:rStyle w:val="VerbatimChar"/>
               </w:rPr>
-              <w:t xml:space="preserve">gameId + userId + clientRequestId</w:t>
-            </w:r>
-            <w:r>
-              <w:t xml:space="preserve">); the primary store dedupes on that key before applying, so retries are safe</w:t>
+              <w:t xml:space="preserve">Idempotency-Key</w:t>
+            </w:r>
+            <w:r>
+              <w:t xml:space="preserve"> </w:t>
+            </w:r>
+            <w:r>
+              <w:t xml:space="preserve">header; the service dedupes on that key (namespaced per endpoint) before applying, so retries are safe</w:t>
             </w:r>
           </w:p>
         </w:tc>
       </w:tr>
     </w:tbl>
-    <w:bookmarkEnd w:id="11"/>
-    <w:bookmarkStart w:id="14" w:name="api-reference"/>
+    <w:bookmarkEnd w:id="12"/>
+    <w:bookmarkStart w:id="15" w:name="api-reference"/>
     <w:p>
       <w:pPr>
         <w:pStyle w:val="Heading2"/>
@@ -732,7 +918,7 @@
         <w:t xml:space="preserve">API Reference</w:t>
       </w:r>
     </w:p>
-    <w:bookmarkStart w:id="12" w:name="games"/>
+    <w:bookmarkStart w:id="13" w:name="games"/>
     <w:p>
       <w:pPr>
         <w:pStyle w:val="Heading3"/>
@@ -1010,8 +1196,8 @@
         </w:tc>
       </w:tr>
     </w:tbl>
-    <w:bookmarkEnd w:id="12"/>
-    <w:bookmarkStart w:id="13" w:name="leaderboard"/>
+    <w:bookmarkEnd w:id="13"/>
+    <w:bookmarkStart w:id="14" w:name="leaderboard"/>
     <w:p>
       <w:pPr>
         <w:pStyle w:val="Heading3"/>
@@ -1481,9 +1667,9 @@
         <w:t xml:space="preserve">); see the README’s Error Handling section for the full status code table.</w:t>
       </w:r>
     </w:p>
-    <w:bookmarkEnd w:id="13"/>
     <w:bookmarkEnd w:id="14"/>
-    <w:bookmarkStart w:id="15" w:name="Xb55c3e5e00aec46dc48af778252e71c83bc07e4"/>
+    <w:bookmarkEnd w:id="15"/>
+    <w:bookmarkStart w:id="16" w:name="Xb55c3e5e00aec46dc48af778252e71c83bc07e4"/>
     <w:p>
       <w:pPr>
         <w:pStyle w:val="Heading2"/>
@@ -1498,188 +1684,6 @@
       </w:pPr>
       <w:r>
         <w:t xml:space="preserve">The service as built today is a single-region, in-memory prototype. It proves out the API shape and business logic, but several pieces described above haven’t been built yet:</w:t>
-      </w:r>
-    </w:p>
-    <w:p>
-      <w:pPr>
-        <w:pStyle w:val="Compact"/>
-        <w:numPr>
-          <w:ilvl w:val="0"/>
-          <w:numId w:val="1002"/>
-        </w:numPr>
-      </w:pPr>
-      <w:r>
-        <w:rPr>
-          <w:b/>
-          <w:bCs/>
-        </w:rPr>
-        <w:t xml:space="preserve">Storage: in-memory instead of SQL.</w:t>
-      </w:r>
-      <w:r>
-        <w:t xml:space="preserve"> </w:t>
-      </w:r>
-      <w:r>
-        <w:t xml:space="preserve">We’re currently using</w:t>
-      </w:r>
-      <w:r>
-        <w:t xml:space="preserve"> </w:t>
-      </w:r>
-      <w:r>
-        <w:rPr>
-          <w:rStyle w:val="VerbatimChar"/>
-        </w:rPr>
-        <w:t xml:space="preserve">ConcurrentHashMap</w:t>
-      </w:r>
-      <w:r>
-        <w:t xml:space="preserve">-backed repositories rather than a real SQL data store, purely to move faster during initial development. A JPA-backed implementation already exists behind the same repository interfaces (see the README’s Storage section), so switching to Postgres/MySQL is a configuration change, not a rewrite — but until that switch happens, we don’t have real durability or the single-leader consistency guarantees the target design calls for.</w:t>
-      </w:r>
-    </w:p>
-    <w:p>
-      <w:pPr>
-        <w:pStyle w:val="Compact"/>
-        <w:numPr>
-          <w:ilvl w:val="0"/>
-          <w:numId w:val="1002"/>
-        </w:numPr>
-      </w:pPr>
-      <w:r>
-        <w:rPr>
-          <w:b/>
-          <w:bCs/>
-        </w:rPr>
-        <w:t xml:space="preserve">No cache layer yet.</w:t>
-      </w:r>
-      <w:r>
-        <w:t xml:space="preserve"> </w:t>
-      </w:r>
-      <w:r>
-        <w:t xml:space="preserve">The target architecture calls for a Redis-backed sorted set per game for fast top-N and rank reads. Right now every read is served directly from the repository (in-memory map or, once switched over, the SQL store) with no caching in front of it. This is fine at small scale, but won’t hold up under the global read volume the non-functional requirements describe.</w:t>
-      </w:r>
-    </w:p>
-    <w:p>
-      <w:pPr>
-        <w:pStyle w:val="Compact"/>
-        <w:numPr>
-          <w:ilvl w:val="0"/>
-          <w:numId w:val="1002"/>
-        </w:numPr>
-      </w:pPr>
-      <w:r>
-        <w:rPr>
-          <w:b/>
-          <w:bCs/>
-        </w:rPr>
-        <w:t xml:space="preserve">ID generation.</w:t>
-      </w:r>
-      <w:r>
-        <w:t xml:space="preserve"> </w:t>
-      </w:r>
-      <w:r>
-        <w:t xml:space="preserve">We’re using an in-memory</w:t>
-      </w:r>
-      <w:r>
-        <w:t xml:space="preserve"> </w:t>
-      </w:r>
-      <w:r>
-        <w:rPr>
-          <w:rStyle w:val="VerbatimChar"/>
-        </w:rPr>
-        <w:t xml:space="preserve">AtomicLong</w:t>
-      </w:r>
-      <w:r>
-        <w:t xml:space="preserve"> </w:t>
-      </w:r>
-      <w:r>
-        <w:t xml:space="preserve">per repository to assign ids. A SQL data store can manage id assignment natively (auto-increment / sequences), which would be the better long-term approach — but for now, the app-generated counter is sufficient and keeps the in-memory and database-backed repositories behaviorally identical.</w:t>
-      </w:r>
-    </w:p>
-    <w:p>
-      <w:pPr>
-        <w:pStyle w:val="Compact"/>
-        <w:numPr>
-          <w:ilvl w:val="0"/>
-          <w:numId w:val="1002"/>
-        </w:numPr>
-      </w:pPr>
-      <w:r>
-        <w:rPr>
-          <w:b/>
-          <w:bCs/>
-        </w:rPr>
-        <w:t xml:space="preserve">No idempotency support yet.</w:t>
-      </w:r>
-      <w:r>
-        <w:t xml:space="preserve"> </w:t>
-      </w:r>
-      <w:r>
-        <w:t xml:space="preserve">The design calls for idempotency keys on writes so retried submissions don’t create duplicates, but this isn’t implemented in the current API —</w:t>
-      </w:r>
-      <w:r>
-        <w:t xml:space="preserve"> </w:t>
-      </w:r>
-      <w:r>
-        <w:rPr>
-          <w:rStyle w:val="VerbatimChar"/>
-        </w:rPr>
-        <w:t xml:space="preserve">POST /api/leaderboard</w:t>
-      </w:r>
-      <w:r>
-        <w:t xml:space="preserve"> </w:t>
-      </w:r>
-      <w:r>
-        <w:t xml:space="preserve">will happily create a new entry on every call, including retries of the same logical submission. Calling this out explicitly as an open gap: it needs design/implementation time we haven’t spent yet, and shouldn’t be assumed to be handled.</w:t>
-      </w:r>
-    </w:p>
-    <w:p>
-      <w:pPr>
-        <w:pStyle w:val="Compact"/>
-        <w:numPr>
-          <w:ilvl w:val="0"/>
-          <w:numId w:val="1002"/>
-        </w:numPr>
-      </w:pPr>
-      <w:r>
-        <w:rPr>
-          <w:b/>
-          <w:bCs/>
-        </w:rPr>
-        <w:t xml:space="preserve">No load balancer yet.</w:t>
-      </w:r>
-      <w:r>
-        <w:t xml:space="preserve"> </w:t>
-      </w:r>
-      <w:r>
-        <w:t xml:space="preserve">The diagram’s</w:t>
-      </w:r>
-      <w:r>
-        <w:t xml:space="preserve"> </w:t>
-      </w:r>
-      <w:r>
-        <w:t xml:space="preserve">“route to nearest region”</w:t>
-      </w:r>
-      <w:r>
-        <w:t xml:space="preserve"> </w:t>
-      </w:r>
-      <w:r>
-        <w:t xml:space="preserve">/ multiple stateless API instances behind a global load balancer doesn’t exist yet — the service currently runs as a single instance. Scaling out to multiple instances/regions depends on this being added.</w:t>
-      </w:r>
-    </w:p>
-    <w:bookmarkEnd w:id="15"/>
-    <w:bookmarkStart w:id="16" w:name="X2cf67073af0901ec2575f469cd3c0bdd66c5e2c"/>
-    <w:p>
-      <w:pPr>
-        <w:pStyle w:val="Heading2"/>
-      </w:pPr>
-      <w:r>
-        <w:t xml:space="preserve">Under Consideration: Dedicated Write Queue</w:t>
-      </w:r>
-    </w:p>
-    <w:p>
-      <w:pPr>
-        <w:pStyle w:val="FirstParagraph"/>
-      </w:pPr>
-      <w:r>
-        <w:t xml:space="preserve">Since writes are explicitly not latency-critical (per the non-functional requirements) while reads must stay fast globally, a dedicated write queue is worth adding once we move past the current prototype:</w:t>
       </w:r>
     </w:p>
     <w:p>
@@ -1695,13 +1699,25 @@
           <w:b/>
           <w:bCs/>
         </w:rPr>
-        <w:t xml:space="preserve">Shape:</w:t>
-      </w:r>
-      <w:r>
-        <w:t xml:space="preserve"> </w:t>
-      </w:r>
-      <w:r>
-        <w:t xml:space="preserve">incoming score submissions land in a durable, persistent queue (e.g. Kafka or SQS — not an in-app/in-memory buffer, since that would lose buffered writes on a crash) rather than writing straight to the primary store.</w:t>
+        <w:t xml:space="preserve">Storage: in-memory instead of SQL.</w:t>
+      </w:r>
+      <w:r>
+        <w:t xml:space="preserve"> </w:t>
+      </w:r>
+      <w:r>
+        <w:t xml:space="preserve">We’re currently using</w:t>
+      </w:r>
+      <w:r>
+        <w:t xml:space="preserve"> </w:t>
+      </w:r>
+      <w:r>
+        <w:rPr>
+          <w:rStyle w:val="VerbatimChar"/>
+        </w:rPr>
+        <w:t xml:space="preserve">ConcurrentHashMap</w:t>
+      </w:r>
+      <w:r>
+        <w:t xml:space="preserve">-backed repositories rather than a real SQL data store, purely to move faster during initial development. A JPA-backed implementation already exists behind the same repository interfaces (see the README’s Storage section), so switching to Postgres/MySQL is a configuration change, not a rewrite — but until that switch happens, we don’t have real durability or the single-leader consistency guarantees the target design calls for.</w:t>
       </w:r>
     </w:p>
     <w:p>
@@ -1717,13 +1733,13 @@
           <w:b/>
           <w:bCs/>
         </w:rPr>
-        <w:t xml:space="preserve">Batching:</w:t>
-      </w:r>
-      <w:r>
-        <w:t xml:space="preserve"> </w:t>
-      </w:r>
-      <w:r>
-        <w:t xml:space="preserve">a consumer flushes the queue as batch inserts to the primary store on a timer or size threshold, instead of one write per request. This trades a small amount of write-visibility latency for much lower write load on the primary store — an acceptable tradeoff given writes aren’t urgent.</w:t>
+        <w:t xml:space="preserve">No cache layer yet.</w:t>
+      </w:r>
+      <w:r>
+        <w:t xml:space="preserve"> </w:t>
+      </w:r>
+      <w:r>
+        <w:t xml:space="preserve">The target architecture calls for a Redis-backed sorted set per game for fast top-N and rank reads. Right now every read is served directly from the repository (in-memory map or, once switched over, the SQL store) with no caching in front of it. This is fine at small scale, but won’t hold up under the global read volume the non-functional requirements describe.</w:t>
       </w:r>
     </w:p>
     <w:p>
@@ -1739,13 +1755,28 @@
           <w:b/>
           <w:bCs/>
         </w:rPr>
-        <w:t xml:space="preserve">Idempotency fits here too:</w:t>
-      </w:r>
-      <w:r>
-        <w:t xml:space="preserve"> </w:t>
-      </w:r>
-      <w:r>
-        <w:t xml:space="preserve">the dedupe check (idempotency key) should happen at enqueue time, before a submission ever reaches a batch, so retries are caught early rather than relying on the batch/DB layer to catch them.</w:t>
+        <w:t xml:space="preserve">ID generation.</w:t>
+      </w:r>
+      <w:r>
+        <w:t xml:space="preserve"> </w:t>
+      </w:r>
+      <w:r>
+        <w:t xml:space="preserve">We’re using an in-memory</w:t>
+      </w:r>
+      <w:r>
+        <w:t xml:space="preserve"> </w:t>
+      </w:r>
+      <w:r>
+        <w:rPr>
+          <w:rStyle w:val="VerbatimChar"/>
+        </w:rPr>
+        <w:t xml:space="preserve">AtomicLong</w:t>
+      </w:r>
+      <w:r>
+        <w:t xml:space="preserve"> </w:t>
+      </w:r>
+      <w:r>
+        <w:t xml:space="preserve">per repository to assign ids. A SQL data store can manage id assignment natively (auto-increment / sequences), which would be the better long-term approach — but for now, the app-generated counter is sufficient and keeps the in-memory and database-backed repositories behaviorally identical.</w:t>
       </w:r>
     </w:p>
     <w:p>
@@ -1761,38 +1792,272 @@
           <w:b/>
           <w:bCs/>
         </w:rPr>
-        <w:t xml:space="preserve">Reads stay unaffected:</w:t>
-      </w:r>
-      <w:r>
-        <w:t xml:space="preserve"> </w:t>
-      </w:r>
-      <w:r>
-        <w:t xml:space="preserve">the read path never touches this queue — it’s served entirely from the regional cache — so batching writes doesn’t add latency to</w:t>
-      </w:r>
-      <w:r>
-        <w:t xml:space="preserve"> </w:t>
-      </w:r>
-      <w:r>
-        <w:rPr>
-          <w:rStyle w:val="VerbatimChar"/>
-        </w:rPr>
-        <w:t xml:space="preserve">GET</w:t>
-      </w:r>
-      <w:r>
-        <w:t xml:space="preserve"> </w:t>
-      </w:r>
-      <w:r>
-        <w:t xml:space="preserve">requests, which matches the priority on fast reads.</w:t>
+        <w:t xml:space="preserve">Idempotency keys are implemented, but only per-instance.</w:t>
+      </w:r>
+      <w:r>
+        <w:t xml:space="preserve"> </w:t>
+      </w:r>
+      <w:r>
+        <w:t xml:space="preserve">A client can send an</w:t>
+      </w:r>
+      <w:r>
+        <w:t xml:space="preserve"> </w:t>
+      </w:r>
+      <w:r>
+        <w:rPr>
+          <w:rStyle w:val="VerbatimChar"/>
+        </w:rPr>
+        <w:t xml:space="preserve">Idempotency-Key</w:t>
+      </w:r>
+      <w:r>
+        <w:t xml:space="preserve"> </w:t>
+      </w:r>
+      <w:r>
+        <w:t xml:space="preserve">header on any</w:t>
+      </w:r>
+      <w:r>
+        <w:t xml:space="preserve"> </w:t>
+      </w:r>
+      <w:r>
+        <w:rPr>
+          <w:rStyle w:val="VerbatimChar"/>
+        </w:rPr>
+        <w:t xml:space="preserve">POST</w:t>
+      </w:r>
+      <w:r>
+        <w:t xml:space="preserve"> </w:t>
+      </w:r>
+      <w:r>
+        <w:t xml:space="preserve">(</w:t>
+      </w:r>
+      <w:r>
+        <w:rPr>
+          <w:rStyle w:val="VerbatimChar"/>
+        </w:rPr>
+        <w:t xml:space="preserve">/api/games</w:t>
+      </w:r>
+      <w:r>
+        <w:t xml:space="preserve"> </w:t>
+      </w:r>
+      <w:r>
+        <w:t xml:space="preserve">or</w:t>
+      </w:r>
+      <w:r>
+        <w:t xml:space="preserve"> </w:t>
+      </w:r>
+      <w:r>
+        <w:rPr>
+          <w:rStyle w:val="VerbatimChar"/>
+        </w:rPr>
+        <w:t xml:space="preserve">/api/leaderboard</w:t>
+      </w:r>
+      <w:r>
+        <w:t xml:space="preserve">);</w:t>
+      </w:r>
+      <w:r>
+        <w:t xml:space="preserve"> </w:t>
+      </w:r>
+      <w:r>
+        <w:rPr>
+          <w:rStyle w:val="VerbatimChar"/>
+        </w:rPr>
+        <w:t xml:space="preserve">IdempotencyFilter</w:t>
+      </w:r>
+      <w:r>
+        <w:t xml:space="preserve"> </w:t>
+      </w:r>
+      <w:r>
+        <w:t xml:space="preserve">dedupes on</w:t>
+      </w:r>
+      <w:r>
+        <w:t xml:space="preserve"> </w:t>
+      </w:r>
+      <w:r>
+        <w:rPr>
+          <w:rStyle w:val="VerbatimChar"/>
+        </w:rPr>
+        <w:t xml:space="preserve">path + key</w:t>
+      </w:r>
+      <w:r>
+        <w:t xml:space="preserve"> </w:t>
+      </w:r>
+      <w:r>
+        <w:t xml:space="preserve">and replays the original response for a repeat, including for genuinely concurrent duplicate requests (the second waits for the first rather than racing it). Only successful (2xx) responses are cached, so a request that failed validation isn’t permanently stuck on that key — the caller can retry it after fixing the problem. The gap versus the target architecture: the dedup table is an in-memory</w:t>
+      </w:r>
+      <w:r>
+        <w:t xml:space="preserve"> </w:t>
+      </w:r>
+      <w:r>
+        <w:rPr>
+          <w:rStyle w:val="VerbatimChar"/>
+        </w:rPr>
+        <w:t xml:space="preserve">ConcurrentHashMap</w:t>
+      </w:r>
+      <w:r>
+        <w:t xml:space="preserve">, not the primary store, so it only catches duplicates within a single app instance. Once this service runs behind a load balancer with multiple instances (per the target architecture’s regional API layer), the same idempotency key sent to two different instances would not be deduped — that requires moving the dedup table into the primary write store itself, as the target design originally called for.</w:t>
+      </w:r>
+    </w:p>
+    <w:p>
+      <w:pPr>
+        <w:pStyle w:val="Compact"/>
+        <w:numPr>
+          <w:ilvl w:val="0"/>
+          <w:numId w:val="1003"/>
+        </w:numPr>
+      </w:pPr>
+      <w:r>
+        <w:rPr>
+          <w:b/>
+          <w:bCs/>
+        </w:rPr>
+        <w:t xml:space="preserve">No load balancer yet.</w:t>
+      </w:r>
+      <w:r>
+        <w:t xml:space="preserve"> </w:t>
+      </w:r>
+      <w:r>
+        <w:t xml:space="preserve">The diagram’s</w:t>
+      </w:r>
+      <w:r>
+        <w:t xml:space="preserve"> </w:t>
+      </w:r>
+      <w:r>
+        <w:t xml:space="preserve">“route to nearest region”</w:t>
+      </w:r>
+      <w:r>
+        <w:t xml:space="preserve"> </w:t>
+      </w:r>
+      <w:r>
+        <w:t xml:space="preserve">/ multiple stateless API instances behind a global load balancer doesn’t exist yet — the service currently runs as a single instance. Scaling out to multiple instances/regions depends on this being added.</w:t>
+      </w:r>
+    </w:p>
+    <w:p>
+      <w:pPr>
+        <w:pStyle w:val="Compact"/>
+        <w:numPr>
+          <w:ilvl w:val="0"/>
+          <w:numId w:val="1003"/>
+        </w:numPr>
+      </w:pPr>
+      <w:r>
+        <w:rPr>
+          <w:b/>
+          <w:bCs/>
+        </w:rPr>
+        <w:t xml:space="preserve">No unique</w:t>
+      </w:r>
+      <w:r>
+        <w:rPr>
+          <w:b/>
+          <w:bCs/>
+        </w:rPr>
+        <w:t xml:space="preserve"> </w:t>
+      </w:r>
+      <w:r>
+        <w:rPr>
+          <w:rStyle w:val="VerbatimChar"/>
+          <w:b/>
+          <w:bCs/>
+        </w:rPr>
+        <w:t xml:space="preserve">userId</w:t>
+      </w:r>
+      <w:r>
+        <w:rPr>
+          <w:b/>
+          <w:bCs/>
+        </w:rPr>
+        <w:t xml:space="preserve">.</w:t>
+      </w:r>
+      <w:r>
+        <w:t xml:space="preserve"> </w:t>
+      </w:r>
+      <w:r>
+        <w:t xml:space="preserve">Functional Requirement 3 calls for a specific</w:t>
+      </w:r>
+      <w:r>
+        <w:t xml:space="preserve"> </w:t>
+      </w:r>
+      <w:r>
+        <w:rPr>
+          <w:rStyle w:val="VerbatimChar"/>
+        </w:rPr>
+        <w:t xml:space="preserve">userId</w:t>
+      </w:r>
+      <w:r>
+        <w:t xml:space="preserve">’s score and rank, but</w:t>
+      </w:r>
+      <w:r>
+        <w:t xml:space="preserve"> </w:t>
+      </w:r>
+      <w:r>
+        <w:rPr>
+          <w:rStyle w:val="VerbatimChar"/>
+        </w:rPr>
+        <w:t xml:space="preserve">LeaderboardEntry</w:t>
+      </w:r>
+      <w:r>
+        <w:t xml:space="preserve"> </w:t>
+      </w:r>
+      <w:r>
+        <w:t xml:space="preserve">currently only has</w:t>
+      </w:r>
+      <w:r>
+        <w:t xml:space="preserve"> </w:t>
+      </w:r>
+      <w:r>
+        <w:rPr>
+          <w:rStyle w:val="VerbatimChar"/>
+        </w:rPr>
+        <w:t xml:space="preserve">playerName</w:t>
+      </w:r>
+      <w:r>
+        <w:t xml:space="preserve">, a free-text string with no identity behind it — two submissions from the same real player aren’t linked, and two different players who pick the same name collide. This also undermines idempotency and the write-queue dedupe design above, both of which assume a stable per-player key (</w:t>
+      </w:r>
+      <w:r>
+        <w:rPr>
+          <w:rStyle w:val="VerbatimChar"/>
+        </w:rPr>
+        <w:t xml:space="preserve">gameId + userId</w:t>
+      </w:r>
+      <w:r>
+        <w:t xml:space="preserve">); right now they can only dedupe on whatever the client happens to put in</w:t>
+      </w:r>
+      <w:r>
+        <w:t xml:space="preserve"> </w:t>
+      </w:r>
+      <w:r>
+        <w:rPr>
+          <w:rStyle w:val="VerbatimChar"/>
+        </w:rPr>
+        <w:t xml:space="preserve">playerName</w:t>
+      </w:r>
+      <w:r>
+        <w:t xml:space="preserve">. A real</w:t>
+      </w:r>
+      <w:r>
+        <w:t xml:space="preserve"> </w:t>
+      </w:r>
+      <w:r>
+        <w:rPr>
+          <w:rStyle w:val="VerbatimChar"/>
+        </w:rPr>
+        <w:t xml:space="preserve">userId</w:t>
+      </w:r>
+      <w:r>
+        <w:t xml:space="preserve"> </w:t>
+      </w:r>
+      <w:r>
+        <w:t xml:space="preserve">(issued by an auth system, not client-chosen text) is a prerequisite for those features to work correctly.</w:t>
       </w:r>
     </w:p>
     <w:bookmarkEnd w:id="16"/>
-    <w:bookmarkStart w:id="17" w:name="Xe5bce76f5307fd57802bf90ce195adb705e26d0"/>
+    <w:bookmarkStart w:id="17" w:name="X2cf67073af0901ec2575f469cd3c0bdd66c5e2c"/>
     <w:p>
       <w:pPr>
         <w:pStyle w:val="Heading2"/>
       </w:pPr>
       <w:r>
-        <w:t xml:space="preserve">Under Consideration: Real-Time Competition Updates</w:t>
+        <w:t xml:space="preserve">Under Consideration: Dedicated Write Queue</w:t>
       </w:r>
     </w:p>
     <w:p>
@@ -1800,19 +2065,7 @@
         <w:pStyle w:val="FirstParagraph"/>
       </w:pPr>
       <w:r>
-        <w:t xml:space="preserve">Batched, cache-served reads are the right default for a general leaderboard — but for a</w:t>
-      </w:r>
-      <w:r>
-        <w:t xml:space="preserve"> </w:t>
-      </w:r>
-      <w:r>
-        <w:t xml:space="preserve">“watch a competition live”</w:t>
-      </w:r>
-      <w:r>
-        <w:t xml:space="preserve"> </w:t>
-      </w:r>
-      <w:r>
-        <w:t xml:space="preserve">feature, someone’s score change should be visible immediately, not on the next cache refresh. This doesn’t require replacing the batching approach above; it can layer on top of it:</w:t>
+        <w:t xml:space="preserve">Since writes are explicitly not latency-critical (per the non-functional requirements) while reads must stay fast globally, a dedicated write queue is worth adding once we move past the current prototype:</w:t>
       </w:r>
     </w:p>
     <w:p>
@@ -1828,13 +2081,13 @@
           <w:b/>
           <w:bCs/>
         </w:rPr>
-        <w:t xml:space="preserve">A second consumer on the same Kafka topic.</w:t>
-      </w:r>
-      <w:r>
-        <w:t xml:space="preserve"> </w:t>
-      </w:r>
-      <w:r>
-        <w:t xml:space="preserve">The write queue already publishes an event per score update. A separate Real-Time Push Service subscribes to that same topic (independently of the batch-insert consumer) and pushes updates out over WebSocket/SSE to clients currently watching a given game or competition.</w:t>
+        <w:t xml:space="preserve">Shape:</w:t>
+      </w:r>
+      <w:r>
+        <w:t xml:space="preserve"> </w:t>
+      </w:r>
+      <w:r>
+        <w:t xml:space="preserve">incoming score submissions land in a durable, persistent queue (e.g. Kafka or SQS — not an in-app/in-memory buffer, since that would lose buffered writes on a crash) rather than writing straight to the primary store.</w:t>
       </w:r>
     </w:p>
     <w:p>
@@ -1850,13 +2103,13 @@
           <w:b/>
           <w:bCs/>
         </w:rPr>
-        <w:t xml:space="preserve">Scoped, not global.</w:t>
-      </w:r>
-      <w:r>
-        <w:t xml:space="preserve"> </w:t>
-      </w:r>
-      <w:r>
-        <w:t xml:space="preserve">This only needs to push to clients actively subscribed to a specific game/competition — not broadcast every score update everywhere — so it stays cheap even at scale.</w:t>
+        <w:t xml:space="preserve">Batching:</w:t>
+      </w:r>
+      <w:r>
+        <w:t xml:space="preserve"> </w:t>
+      </w:r>
+      <w:r>
+        <w:t xml:space="preserve">a consumer flushes the queue as batch inserts to the primary store on a timer or size threshold, instead of one write per request. This trades a small amount of write-visibility latency for much lower write load on the primary store — an acceptable tradeoff given writes aren’t urgent.</w:t>
       </w:r>
     </w:p>
     <w:p>
@@ -1872,28 +2125,13 @@
           <w:b/>
           <w:bCs/>
         </w:rPr>
-        <w:t xml:space="preserve">Doesn’t compromise the read-priority design.</w:t>
-      </w:r>
-      <w:r>
-        <w:t xml:space="preserve"> </w:t>
-      </w:r>
-      <w:r>
-        <w:t xml:space="preserve">The cache-backed</w:t>
-      </w:r>
-      <w:r>
-        <w:t xml:space="preserve"> </w:t>
-      </w:r>
-      <w:r>
-        <w:rPr>
-          <w:rStyle w:val="VerbatimChar"/>
-        </w:rPr>
-        <w:t xml:space="preserve">GET</w:t>
-      </w:r>
-      <w:r>
-        <w:t xml:space="preserve"> </w:t>
-      </w:r>
-      <w:r>
-        <w:t xml:space="preserve">endpoints stay as the default, low-cost path for everyone else; live push is an opt-in feature for whoever’s actively watching a competition, not a replacement for the general read path.</w:t>
+        <w:t xml:space="preserve">Idempotency fits here too:</w:t>
+      </w:r>
+      <w:r>
+        <w:t xml:space="preserve"> </w:t>
+      </w:r>
+      <w:r>
+        <w:t xml:space="preserve">the dedupe check (idempotency key) should happen at enqueue time, before a submission ever reaches a batch, so retries are caught early rather than relying on the batch/DB layer to catch them.</w:t>
       </w:r>
     </w:p>
     <w:p>
@@ -1909,6 +2147,154 @@
           <w:b/>
           <w:bCs/>
         </w:rPr>
+        <w:t xml:space="preserve">Reads stay unaffected:</w:t>
+      </w:r>
+      <w:r>
+        <w:t xml:space="preserve"> </w:t>
+      </w:r>
+      <w:r>
+        <w:t xml:space="preserve">the read path never touches this queue — it’s served entirely from the regional cache — so batching writes doesn’t add latency to</w:t>
+      </w:r>
+      <w:r>
+        <w:t xml:space="preserve"> </w:t>
+      </w:r>
+      <w:r>
+        <w:rPr>
+          <w:rStyle w:val="VerbatimChar"/>
+        </w:rPr>
+        <w:t xml:space="preserve">GET</w:t>
+      </w:r>
+      <w:r>
+        <w:t xml:space="preserve"> </w:t>
+      </w:r>
+      <w:r>
+        <w:t xml:space="preserve">requests, which matches the priority on fast reads.</w:t>
+      </w:r>
+    </w:p>
+    <w:bookmarkEnd w:id="17"/>
+    <w:bookmarkStart w:id="18" w:name="Xe5bce76f5307fd57802bf90ce195adb705e26d0"/>
+    <w:p>
+      <w:pPr>
+        <w:pStyle w:val="Heading2"/>
+      </w:pPr>
+      <w:r>
+        <w:t xml:space="preserve">Under Consideration: Real-Time Competition Updates</w:t>
+      </w:r>
+    </w:p>
+    <w:p>
+      <w:pPr>
+        <w:pStyle w:val="FirstParagraph"/>
+      </w:pPr>
+      <w:r>
+        <w:t xml:space="preserve">Batched, cache-served reads are the right default for a general leaderboard — but for a</w:t>
+      </w:r>
+      <w:r>
+        <w:t xml:space="preserve"> </w:t>
+      </w:r>
+      <w:r>
+        <w:t xml:space="preserve">“watch a competition live”</w:t>
+      </w:r>
+      <w:r>
+        <w:t xml:space="preserve"> </w:t>
+      </w:r>
+      <w:r>
+        <w:t xml:space="preserve">feature, someone’s score change should be visible immediately, not on the next cache refresh. This doesn’t require replacing the batching approach above; it can layer on top of it:</w:t>
+      </w:r>
+    </w:p>
+    <w:p>
+      <w:pPr>
+        <w:pStyle w:val="Compact"/>
+        <w:numPr>
+          <w:ilvl w:val="0"/>
+          <w:numId w:val="1005"/>
+        </w:numPr>
+      </w:pPr>
+      <w:r>
+        <w:rPr>
+          <w:b/>
+          <w:bCs/>
+        </w:rPr>
+        <w:t xml:space="preserve">A second consumer on the same Kafka topic.</w:t>
+      </w:r>
+      <w:r>
+        <w:t xml:space="preserve"> </w:t>
+      </w:r>
+      <w:r>
+        <w:t xml:space="preserve">The write queue already publishes an event per score update. A separate Real-Time Push Service subscribes to that same topic (independently of the batch-insert consumer) and pushes updates out over WebSocket/SSE to clients currently watching a given game or competition.</w:t>
+      </w:r>
+    </w:p>
+    <w:p>
+      <w:pPr>
+        <w:pStyle w:val="Compact"/>
+        <w:numPr>
+          <w:ilvl w:val="0"/>
+          <w:numId w:val="1005"/>
+        </w:numPr>
+      </w:pPr>
+      <w:r>
+        <w:rPr>
+          <w:b/>
+          <w:bCs/>
+        </w:rPr>
+        <w:t xml:space="preserve">Scoped, not global.</w:t>
+      </w:r>
+      <w:r>
+        <w:t xml:space="preserve"> </w:t>
+      </w:r>
+      <w:r>
+        <w:t xml:space="preserve">This only needs to push to clients actively subscribed to a specific game/competition — not broadcast every score update everywhere — so it stays cheap even at scale.</w:t>
+      </w:r>
+    </w:p>
+    <w:p>
+      <w:pPr>
+        <w:pStyle w:val="Compact"/>
+        <w:numPr>
+          <w:ilvl w:val="0"/>
+          <w:numId w:val="1005"/>
+        </w:numPr>
+      </w:pPr>
+      <w:r>
+        <w:rPr>
+          <w:b/>
+          <w:bCs/>
+        </w:rPr>
+        <w:t xml:space="preserve">Doesn’t compromise the read-priority design.</w:t>
+      </w:r>
+      <w:r>
+        <w:t xml:space="preserve"> </w:t>
+      </w:r>
+      <w:r>
+        <w:t xml:space="preserve">The cache-backed</w:t>
+      </w:r>
+      <w:r>
+        <w:t xml:space="preserve"> </w:t>
+      </w:r>
+      <w:r>
+        <w:rPr>
+          <w:rStyle w:val="VerbatimChar"/>
+        </w:rPr>
+        <w:t xml:space="preserve">GET</w:t>
+      </w:r>
+      <w:r>
+        <w:t xml:space="preserve"> </w:t>
+      </w:r>
+      <w:r>
+        <w:t xml:space="preserve">endpoints stay as the default, low-cost path for everyone else; live push is an opt-in feature for whoever’s actively watching a competition, not a replacement for the general read path.</w:t>
+      </w:r>
+    </w:p>
+    <w:p>
+      <w:pPr>
+        <w:pStyle w:val="Compact"/>
+        <w:numPr>
+          <w:ilvl w:val="0"/>
+          <w:numId w:val="1005"/>
+        </w:numPr>
+      </w:pPr>
+      <w:r>
+        <w:rPr>
+          <w:b/>
+          <w:bCs/>
+        </w:rPr>
         <w:t xml:space="preserve">Not yet implemented.</w:t>
       </w:r>
       <w:r>
@@ -1918,8 +2304,8 @@
         <w:t xml:space="preserve">This is a future capability to design for, not something the current service does — called out here so the option is preserved (e.g. by keeping write events flowing through a single topic that can gain additional consumers later) rather than designed away.</w:t>
       </w:r>
     </w:p>
-    <w:bookmarkEnd w:id="17"/>
     <w:bookmarkEnd w:id="18"/>
+    <w:bookmarkEnd w:id="19"/>
     <w:sectPr>
       <w:footnotePr>
         <w:numRestart w:val="eachSect"/>
@@ -2252,12 +2638,42 @@
     </w:lvlOverride>
   </w:num>
   <w:num w:numId="1002">
-    <w:abstractNumId w:val="991"/>
+    <w:abstractNumId w:val="99411"/>
+    <w:lvlOverride w:ilvl="0">
+      <w:startOverride w:val="1"/>
+    </w:lvlOverride>
+    <w:lvlOverride w:ilvl="1">
+      <w:startOverride w:val="1"/>
+    </w:lvlOverride>
+    <w:lvlOverride w:ilvl="2">
+      <w:startOverride w:val="1"/>
+    </w:lvlOverride>
+    <w:lvlOverride w:ilvl="3">
+      <w:startOverride w:val="1"/>
+    </w:lvlOverride>
+    <w:lvlOverride w:ilvl="4">
+      <w:startOverride w:val="1"/>
+    </w:lvlOverride>
+    <w:lvlOverride w:ilvl="5">
+      <w:startOverride w:val="1"/>
+    </w:lvlOverride>
+    <w:lvlOverride w:ilvl="6">
+      <w:startOverride w:val="1"/>
+    </w:lvlOverride>
+    <w:lvlOverride w:ilvl="7">
+      <w:startOverride w:val="1"/>
+    </w:lvlOverride>
+    <w:lvlOverride w:ilvl="8">
+      <w:startOverride w:val="1"/>
+    </w:lvlOverride>
   </w:num>
   <w:num w:numId="1003">
     <w:abstractNumId w:val="991"/>
   </w:num>
   <w:num w:numId="1004">
+    <w:abstractNumId w:val="991"/>
+  </w:num>
+  <w:num w:numId="1005">
     <w:abstractNumId w:val="991"/>
   </w:num>
 </w:numbering>

</xml_diff>